<commit_message>
Update draft DOCX numbers to match main.tex and README
</commit_message>
<xml_diff>
--- a/paper/damped-oscillator-draft-v01.docx
+++ b/paper/damped-oscillator-draft-v01.docx
@@ -41,7 +41,7 @@
           <ns0:b ns0:val="0"/>
           <ns0:i ns0:val="0"/>
         </ns0:rPr>
-        <ns0:t xml:space="preserve">We compare three time-integration schemes—explicit Euler, a velocity-Verlet-type scheme adapted for velocity-dependent damping, and classical fourth-order Runge–Kutta (RK4)—on the dimensionless damped harmonic oscillator x″ + 2ζ x′ + x = 0 with x(0) = 1, x′(0) = 0, for damping ratios ζ∈{0.1,1,2}. Using closed-form analytic solutions as reference, we measure the maximum displacement error E∞ over step sizes h∈{0.2,0.1,0.05,0.025,0.0125} on t∈[0,20]. The observed convergence orders are 1.27/1.03/1.11 (Euler), 2.02/2.00/2.00 (Verlet-type), and 4.00/4.07/4.19 (RK4), matching the theoretical orders 1, 2, and 4. A fine scan around the Euler linear-stability boundary at ζ = 0.1 shows the measured envelope-decay error crossing 100% exactly at the predicted boundary h = 2ζ = 0.2, agreeing with the amplification-factor theory to within 3.1×10⁻⁵. In a long undamped (ζ = 0) run to t = 100, Euler exhibits secular energy growth (1 + h²)ⁿ (reaching 3.3×10⁸ at h = 0.2), the Verlet-type scheme keeps energy bounded within ∼ h²/4, and RK4 shows the smallest drift (4.4×10⁻⁴). We document honestly that the Verlet-type scheme used here is </ns0:t>
+        <ns0:t xml:space="preserve">We compare three time-integration schemes—explicit Euler, a velocity-Verlet-type scheme adapted for velocity-dependent damping, and classical fourth-order Runge–Kutta (RK4)—on the dimensionless damped harmonic oscillator x″ + 2ζ x′ + x = 0 with x(0) = 1, x′(0) = 0, for damping ratios ζ∈{0.1,1,2}. Using closed-form analytic solutions as reference, we measure the maximum displacement error E∞ over step sizes h∈{0.2,0.1,0.05,0.025,0.0125} on t∈[0,20]. The observed convergence orders are 1.27/1.03/1.11 (Euler), 2.02/2.10/2.20 (Verlet-type), and 4.00/4.07/4.19 (RK4), matching the theoretical orders 1, 2, and 4. A fine scan around the Euler linear-stability boundary at ζ = 0.1 shows the measured envelope-decay error crossing 100% exactly at the predicted boundary h = 2ζ = 0.2, agreeing with the amplification-factor theory to within 3.1×10⁻⁵. In a long undamped (ζ = 0) run to t = 100, Euler exhibits secular energy growth (1 + h²)ⁿ (reaching 3.3×10⁸ at h = 0.2), the Verlet-type scheme keeps energy bounded within ∼ h²/4, and RK4 shows the smallest drift (4.4×10⁻⁴). We document honestly that the Verlet-type scheme used here is </ns0:t>
       </ns0:r>
       <ns0:r>
         <ns0:rPr>
@@ -726,7 +726,7 @@
                 <ns0:b ns0:val="0"/>
                 <ns0:i ns0:val="0"/>
               </ns0:rPr>
-              <ns0:t>2.00</ns0:t>
+              <ns0:t>2.10</ns0:t>
             </ns0:r>
           </ns0:p>
         </ns0:tc>
@@ -740,7 +740,7 @@
                 <ns0:b ns0:val="0"/>
                 <ns0:i ns0:val="0"/>
               </ns0:rPr>
-              <ns0:t>2.00</ns0:t>
+              <ns0:t>2.20</ns0:t>
             </ns0:r>
           </ns0:p>
         </ns0:tc>
@@ -1299,7 +1299,7 @@
           <ns0:b ns0:val="0"/>
           <ns0:i ns0:val="0"/>
         </ns0:rPr>
-        <ns0:t xml:space="preserve">The saved metrics.csv column phase_slope holds per-period peak-time drift. The implementation (analysis.phase_error) returns the least-squares slope; the CSV values have been refreshed to match the corrected implementation. A direct recomputation from the saved trajectories at ζ = 0.1, h = 0.2 with parabolically refined peaks gives approximate drifts of -0.042 s/period (Euler), -0.0083 s/period (Verlet-type), and + 0.0003 s/period (RK4) against the exact period T = 6.315 s—but with only three peaks in t∈[0,20] these are coarse estimates, and we present them as such.</ns0:t>
+        <ns0:t>The saved metrics.csv column phase_slope holds per-period peak-time drift. The implementation (analysis.phase_error) returns the least-squares slope; the CSV values have been refreshed to match the corrected implementation. A direct recomputation from the saved trajectories at ζ = 0.1, h = 0.2 with parabolically refined peaks gives approximate drifts of -0.042 s/period (Euler), -0.0097 s/period (Verlet-type), and + 0.0003 s/period (RK4) against the exact period T = 6.315 s—but with only three peaks in t∈[0,20] these are coarse estimates, and we present them as such.</ns0:t>
       </ns0:r>
       <ns0:r>
         <ns0:rPr>

</xml_diff>

<commit_message>
Update draft DOCX numbers to match main.tex and README (#3)
Co-authored-by: Instinct <noreply@example.com>
</commit_message>
<xml_diff>
--- a/paper/damped-oscillator-draft-v01.docx
+++ b/paper/damped-oscillator-draft-v01.docx
@@ -41,7 +41,7 @@
           <ns0:b ns0:val="0"/>
           <ns0:i ns0:val="0"/>
         </ns0:rPr>
-        <ns0:t xml:space="preserve">We compare three time-integration schemes—explicit Euler, a velocity-Verlet-type scheme adapted for velocity-dependent damping, and classical fourth-order Runge–Kutta (RK4)—on the dimensionless damped harmonic oscillator x″ + 2ζ x′ + x = 0 with x(0) = 1, x′(0) = 0, for damping ratios ζ∈{0.1,1,2}. Using closed-form analytic solutions as reference, we measure the maximum displacement error E∞ over step sizes h∈{0.2,0.1,0.05,0.025,0.0125} on t∈[0,20]. The observed convergence orders are 1.27/1.03/1.11 (Euler), 2.02/2.00/2.00 (Verlet-type), and 4.00/4.07/4.19 (RK4), matching the theoretical orders 1, 2, and 4. A fine scan around the Euler linear-stability boundary at ζ = 0.1 shows the measured envelope-decay error crossing 100% exactly at the predicted boundary h = 2ζ = 0.2, agreeing with the amplification-factor theory to within 3.1×10⁻⁵. In a long undamped (ζ = 0) run to t = 100, Euler exhibits secular energy growth (1 + h²)ⁿ (reaching 3.3×10⁸ at h = 0.2), the Verlet-type scheme keeps energy bounded within ∼ h²/4, and RK4 shows the smallest drift (4.4×10⁻⁴). We document honestly that the Verlet-type scheme used here is </ns0:t>
+        <ns0:t xml:space="preserve">We compare three time-integration schemes—explicit Euler, a velocity-Verlet-type scheme adapted for velocity-dependent damping, and classical fourth-order Runge–Kutta (RK4)—on the dimensionless damped harmonic oscillator x″ + 2ζ x′ + x = 0 with x(0) = 1, x′(0) = 0, for damping ratios ζ∈{0.1,1,2}. Using closed-form analytic solutions as reference, we measure the maximum displacement error E∞ over step sizes h∈{0.2,0.1,0.05,0.025,0.0125} on t∈[0,20]. The observed convergence orders are 1.27/1.03/1.11 (Euler), 2.02/2.10/2.20 (Verlet-type), and 4.00/4.07/4.19 (RK4), matching the theoretical orders 1, 2, and 4. A fine scan around the Euler linear-stability boundary at ζ = 0.1 shows the measured envelope-decay error crossing 100% exactly at the predicted boundary h = 2ζ = 0.2, agreeing with the amplification-factor theory to within 3.1×10⁻⁵. In a long undamped (ζ = 0) run to t = 100, Euler exhibits secular energy growth (1 + h²)ⁿ (reaching 3.3×10⁸ at h = 0.2), the Verlet-type scheme keeps energy bounded within ∼ h²/4, and RK4 shows the smallest drift (4.4×10⁻⁴). We document honestly that the Verlet-type scheme used here is </ns0:t>
       </ns0:r>
       <ns0:r>
         <ns0:rPr>
@@ -726,7 +726,7 @@
                 <ns0:b ns0:val="0"/>
                 <ns0:i ns0:val="0"/>
               </ns0:rPr>
-              <ns0:t>2.00</ns0:t>
+              <ns0:t>2.10</ns0:t>
             </ns0:r>
           </ns0:p>
         </ns0:tc>
@@ -740,7 +740,7 @@
                 <ns0:b ns0:val="0"/>
                 <ns0:i ns0:val="0"/>
               </ns0:rPr>
-              <ns0:t>2.00</ns0:t>
+              <ns0:t>2.20</ns0:t>
             </ns0:r>
           </ns0:p>
         </ns0:tc>
@@ -1299,7 +1299,7 @@
           <ns0:b ns0:val="0"/>
           <ns0:i ns0:val="0"/>
         </ns0:rPr>
-        <ns0:t xml:space="preserve">The saved metrics.csv column phase_slope holds per-period peak-time drift. The implementation (analysis.phase_error) returns the least-squares slope; the CSV values have been refreshed to match the corrected implementation. A direct recomputation from the saved trajectories at ζ = 0.1, h = 0.2 with parabolically refined peaks gives approximate drifts of -0.042 s/period (Euler), -0.0083 s/period (Verlet-type), and + 0.0003 s/period (RK4) against the exact period T = 6.315 s—but with only three peaks in t∈[0,20] these are coarse estimates, and we present them as such.</ns0:t>
+        <ns0:t>The saved metrics.csv column phase_slope holds per-period peak-time drift. The implementation (analysis.phase_error) returns the least-squares slope; the CSV values have been refreshed to match the corrected implementation. A direct recomputation from the saved trajectories at ζ = 0.1, h = 0.2 with parabolically refined peaks gives approximate drifts of -0.042 s/period (Euler), -0.0097 s/period (Verlet-type), and + 0.0003 s/period (RK4) against the exact period T = 6.315 s—but with only three peaks in t∈[0,20] these are coarse estimates, and we present them as such.</ns0:t>
       </ns0:r>
       <ns0:r>
         <ns0:rPr>

</xml_diff>

<commit_message>
Correct cost-vs-accuracy claim (3-6 -> ~4-5 orders where costs overlap) and 1.7 ms example; add tests against saved cpu_time
</commit_message>
<xml_diff>
--- a/paper/damped-oscillator-draft-v01.docx
+++ b/paper/damped-oscillator-draft-v01.docx
@@ -828,7 +828,7 @@
           <ns0:b ns0:val="0"/>
           <ns0:i ns0:val="0"/>
         </ns0:rPr>
-        <ns0:t>On cost versus accuracy (Fig. 3), RK4 dominates: at equal wall-clock cost it is 3–6 orders of magnitude more accurate than Euler (e.g. at ζ = 0.1, for ∼1.7 ms of compute, RK4 at h = 0.05 gives E∞ = 1.9×10⁻⁷ while Euler at h = 0.0125 gives 2.4×10⁻²). The Verlet-type scheme is the economical middle ground; Euler is defensible only when very coarse accuracy suffices. Timing is machine-dependent, so the exact positions in Fig. 3 vary between runs.</ns0:t>
+        <ns0:t>On cost versus accuracy (Fig. 3), RK4 dominates: at equal wall-clock cost it is roughly 4–5 orders of magnitude more accurate than Euler where the measured costs overlap (e.g. at ζ = 0.1, for ∼0.9 ms of compute, RK4 at h = 0.05 gives E∞ = 1.9×10⁻⁷ while Euler at h = 0.0125 gives 2.4×10⁻²). The Verlet-type scheme is the economical middle ground; Euler is defensible only when very coarse accuracy suffices. Timing is machine-dependent, so the exact positions in Fig. 3 vary between runs.</ns0:t>
       </ns0:r>
     </ns0:p>
     <ns0:p>
@@ -987,7 +987,7 @@
           <ns0:i ns0:val="0"/>
           <ns0:sz ns0:val="18"/>
         </ns0:rPr>
-        <ns0:t>Figure 3. Wall-clock cost versus E∞ at ζ = 0.1. RK4 gives 3–6 orders of magnitude better accuracy at equal cost.</ns0:t>
+        <ns0:t>Figure 3. Wall-clock cost versus E∞ at ζ = 0.1. RK4 gives roughly 4–5 orders of magnitude better accuracy at equal cost where the measured costs overlap.</ns0:t>
       </ns0:r>
     </ns0:p>
     <ns0:p>

</xml_diff>

<commit_message>
Correct cost-vs-accuracy claim and 1.7 ms example (check against saved cpu_time) (#14)
* Correct cost-vs-accuracy claim (3-6 -> ~4-5 orders where costs overlap) and 1.7 ms example; add tests against saved cpu_time

* Fix regex in cost claim test

---------

Co-authored-by: Instinct Agent <agent@instinct.com>
</commit_message>
<xml_diff>
--- a/paper/damped-oscillator-draft-v01.docx
+++ b/paper/damped-oscillator-draft-v01.docx
@@ -828,7 +828,7 @@
           <ns0:b ns0:val="0"/>
           <ns0:i ns0:val="0"/>
         </ns0:rPr>
-        <ns0:t>On cost versus accuracy (Fig. 3), RK4 dominates: at equal wall-clock cost it is 3–6 orders of magnitude more accurate than Euler (e.g. at ζ = 0.1, for ∼1.7 ms of compute, RK4 at h = 0.05 gives E∞ = 1.9×10⁻⁷ while Euler at h = 0.0125 gives 2.4×10⁻²). The Verlet-type scheme is the economical middle ground; Euler is defensible only when very coarse accuracy suffices. Timing is machine-dependent, so the exact positions in Fig. 3 vary between runs.</ns0:t>
+        <ns0:t>On cost versus accuracy (Fig. 3), RK4 dominates: at equal wall-clock cost it is roughly 4–5 orders of magnitude more accurate than Euler where the measured costs overlap (e.g. at ζ = 0.1, for ∼0.9 ms of compute, RK4 at h = 0.05 gives E∞ = 1.9×10⁻⁷ while Euler at h = 0.0125 gives 2.4×10⁻²). The Verlet-type scheme is the economical middle ground; Euler is defensible only when very coarse accuracy suffices. Timing is machine-dependent, so the exact positions in Fig. 3 vary between runs.</ns0:t>
       </ns0:r>
     </ns0:p>
     <ns0:p>
@@ -987,7 +987,7 @@
           <ns0:i ns0:val="0"/>
           <ns0:sz ns0:val="18"/>
         </ns0:rPr>
-        <ns0:t>Figure 3. Wall-clock cost versus E∞ at ζ = 0.1. RK4 gives 3–6 orders of magnitude better accuracy at equal cost.</ns0:t>
+        <ns0:t>Figure 3. Wall-clock cost versus E∞ at ζ = 0.1. RK4 gives roughly 4–5 orders of magnitude better accuracy at equal cost where the measured costs overlap.</ns0:t>
       </ns0:r>
     </ns0:p>
     <ns0:p>

</xml_diff>